<commit_message>
docs: legal brief — API marked dormant at launch (no keys issued)
Co-Authored-By: Claude Fable 5 <noreply@anthropic.com>
</commit_message>
<xml_diff>
--- a/docs/LEGAL-BRIEF.docx
+++ b/docs/LEGAL-BRIEF.docx
@@ -947,19 +947,20 @@
           <w:b/>
           <w:bCs/>
         </w:rPr>
-        <w:t xml:space="preserve">API partners:</w:t>
-      </w:r>
-      <w:r>
-        <w:t xml:space="preserve"> </w:t>
-      </w:r>
-      <w:r>
-        <w:rPr>
-          <w:rFonts w:ascii="Courier New" w:cs="Courier New" w:eastAsia="Courier New" w:hAnsi="Courier New"/>
-        </w:rPr>
-        <w:t xml:space="preserve">/api/v1</w:t>
-      </w:r>
-      <w:r>
-        <w:t xml:space="preserve"> requires an API key we issue manually; we log request counts per key for quota enforcement. Key holders are business partners, not consumers.</w:t>
+        <w:t xml:space="preserve">API (not in service):</w:t>
+      </w:r>
+      <w:r>
+        <w:t xml:space="preserve"> a keyed read-only JSON API exists in the codebase but is </w:t>
+      </w:r>
+      <w:r>
+        <w:rPr>
+          <w:b/>
+          <w:bCs/>
+        </w:rPr>
+        <w:t xml:space="preserve">not activated at launch</w:t>
+      </w:r>
+      <w:r>
+        <w:t xml:space="preserve"> — no keys have been issued to anyone, and without a key every request is rejected. If/when partner access begins, keys will be issued under written terms and this brief updated; no consumer data is involved either way.</w:t>
       </w:r>
     </w:p>
     <w:p>
@@ -1065,7 +1066,17 @@
         <w:t xml:space="preserve">API:</w:t>
       </w:r>
       <w:r>
-        <w:t xml:space="preserve"> free tier with mandatory attribution ("Data: Variable" + link), enforced per-key daily quota. Commercial licensing contemplated but not live.</w:t>
+        <w:t xml:space="preserve"> built but </w:t>
+      </w:r>
+      <w:r>
+        <w:rPr>
+          <w:b/>
+          <w:bCs/>
+        </w:rPr>
+        <w:t xml:space="preserve">dormant at launch</w:t>
+      </w:r>
+      <w:r>
+        <w:t xml:space="preserve"> (no keys issued, all requests rejected). Planned model when activated: free tier with mandatory attribution, per-key quotas; commercial licensing contemplated. Terms for it can wait until activation.</w:t>
       </w:r>
     </w:p>
     <w:p>

</xml_diff>

<commit_message>
docs: legal brief — GA4 added to analytics disclosure (consent-banner flag)
Co-Authored-By: Claude Fable 5 <noreply@anthropic.com>
</commit_message>
<xml_diff>
--- a/docs/LEGAL-BRIEF.docx
+++ b/docs/LEGAL-BRIEF.docx
@@ -883,10 +883,40 @@
           <w:b/>
           <w:bCs/>
         </w:rPr>
-        <w:t xml:space="preserve">Analytics: Vercel Web Analytics is enabled</w:t>
-      </w:r>
-      <w:r>
-        <w:t xml:space="preserve"> (as of launch) — a cookieless, aggregate measurement service (page views, referrers, countries, device class, performance metrics). No cross-site tracking, no user-level profiles, no advertising identifiers. ⚖️ Privacy policy should name it in one line.</w:t>
+        <w:t xml:space="preserve">Analytics — two services at launch:</w:t>
+      </w:r>
+      <w:r>
+        <w:t xml:space="preserve"> (1) </w:t>
+      </w:r>
+      <w:r>
+        <w:rPr>
+          <w:b/>
+          <w:bCs/>
+        </w:rPr>
+        <w:t xml:space="preserve">Vercel Web Analytics</w:t>
+      </w:r>
+      <w:r>
+        <w:t xml:space="preserve"> — cookieless, aggregate (page views, referrers, countries, performance). (2) </w:t>
+      </w:r>
+      <w:r>
+        <w:rPr>
+          <w:b/>
+          <w:bCs/>
+        </w:rPr>
+        <w:t xml:space="preserve">Google Analytics 4</w:t>
+      </w:r>
+      <w:r>
+        <w:t xml:space="preserve"> — added at the company's direction; GA4 </w:t>
+      </w:r>
+      <w:r>
+        <w:rPr>
+          <w:b/>
+          <w:bCs/>
+        </w:rPr>
+        <w:t xml:space="preserve">sets cookies/device identifiers</w:t>
+      </w:r>
+      <w:r>
+        <w:t xml:space="preserve"> and transmits usage data to Google (acting as processor). ⚖️ Counsel must advise on: cookie-consent banner requirement for EU/UK/other visitors (GDPR/ePrivacy), Google data-processing terms acceptance, IP-handling settings, and naming both services in the privacy policy. Until advised otherwise, GA should be configured with consent-mode defaults appropriate to target jurisdictions.</w:t>
       </w:r>
     </w:p>
     <w:p>
@@ -905,14 +935,7 @@
         <w:t xml:space="preserve">No other tracking SDKs</w:t>
       </w:r>
       <w:r>
-        <w:t xml:space="preserve"> (no Google Analytics, no Meta pixel, no Sentry). </w:t>
-      </w:r>
-      <w:r>
-        <w:rPr>
-          <w:b/>
-          <w:bCs/>
-        </w:rPr>
-        <w:t xml:space="preserve">No cookies set by our code.</w:t>
+        <w:t xml:space="preserve"> (no Meta pixel, no Sentry). Aside from GA4's, no cookies are set by our code.</w:t>
       </w:r>
     </w:p>
     <w:p>

</xml_diff>